<commit_message>
Novo DOC e correcao do coordenador
</commit_message>
<xml_diff>
--- a/Documentação/ESI - Documento de Especificação de Requisitos de Software.docx
+++ b/Documentação/ESI - Documento de Especificação de Requisitos de Software.docx
@@ -17,7 +17,9 @@
         </w:rPr>
       </w:pPr>
       <w:bookmarkStart w:id="0" w:name="_jco22yywfybg" w:colFirst="0" w:colLast="0"/>
+      <w:bookmarkStart w:id="1" w:name="_Hlk200902267"/>
       <w:bookmarkEnd w:id="0"/>
+      <w:bookmarkEnd w:id="1"/>
       <w:r>
         <w:rPr>
           <w:b/>
@@ -133,8 +135,8 @@
           <w:szCs w:val="26"/>
         </w:rPr>
       </w:pPr>
-      <w:bookmarkStart w:id="1" w:name="_a22diupoz6wy" w:colFirst="0" w:colLast="0"/>
-      <w:bookmarkEnd w:id="1"/>
+      <w:bookmarkStart w:id="2" w:name="_a22diupoz6wy" w:colFirst="0" w:colLast="0"/>
+      <w:bookmarkEnd w:id="2"/>
       <w:r>
         <w:rPr>
           <w:b/>
@@ -159,8 +161,8 @@
           <w:szCs w:val="22"/>
         </w:rPr>
       </w:pPr>
-      <w:bookmarkStart w:id="2" w:name="_x7yiidah6kcx" w:colFirst="0" w:colLast="0"/>
-      <w:bookmarkEnd w:id="2"/>
+      <w:bookmarkStart w:id="3" w:name="_x7yiidah6kcx" w:colFirst="0" w:colLast="0"/>
+      <w:bookmarkEnd w:id="3"/>
       <w:r>
         <w:rPr>
           <w:b/>
@@ -305,8 +307,8 @@
           <w:szCs w:val="26"/>
         </w:rPr>
       </w:pPr>
-      <w:bookmarkStart w:id="3" w:name="_ml1h7lky4mw6" w:colFirst="0" w:colLast="0"/>
-      <w:bookmarkEnd w:id="3"/>
+      <w:bookmarkStart w:id="4" w:name="_ml1h7lky4mw6" w:colFirst="0" w:colLast="0"/>
+      <w:bookmarkEnd w:id="4"/>
       <w:r>
         <w:rPr>
           <w:b/>
@@ -331,8 +333,8 @@
           <w:szCs w:val="22"/>
         </w:rPr>
       </w:pPr>
-      <w:bookmarkStart w:id="4" w:name="_q8fhvy2k5rxx" w:colFirst="0" w:colLast="0"/>
-      <w:bookmarkEnd w:id="4"/>
+      <w:bookmarkStart w:id="5" w:name="_q8fhvy2k5rxx" w:colFirst="0" w:colLast="0"/>
+      <w:bookmarkEnd w:id="5"/>
       <w:r>
         <w:rPr>
           <w:b/>
@@ -827,8 +829,8 @@
           <w:szCs w:val="26"/>
         </w:rPr>
       </w:pPr>
-      <w:bookmarkStart w:id="5" w:name="_1sig27bymmri" w:colFirst="0" w:colLast="0"/>
-      <w:bookmarkEnd w:id="5"/>
+      <w:bookmarkStart w:id="6" w:name="_1sig27bymmri" w:colFirst="0" w:colLast="0"/>
+      <w:bookmarkEnd w:id="6"/>
       <w:r>
         <w:rPr>
           <w:b/>
@@ -2184,15 +2186,15 @@
       <w:pPr>
         <w:jc w:val="both"/>
       </w:pPr>
-      <w:bookmarkStart w:id="6" w:name="_e8bpcxd01owq" w:colFirst="0" w:colLast="0"/>
-      <w:bookmarkEnd w:id="6"/>
-    </w:p>
-    <w:p>
-      <w:pPr>
-        <w:jc w:val="both"/>
-      </w:pPr>
-      <w:bookmarkStart w:id="7" w:name="_4mssgf4l9fqw" w:colFirst="0" w:colLast="0"/>
+      <w:bookmarkStart w:id="7" w:name="_e8bpcxd01owq" w:colFirst="0" w:colLast="0"/>
       <w:bookmarkEnd w:id="7"/>
+    </w:p>
+    <w:p>
+      <w:pPr>
+        <w:jc w:val="both"/>
+      </w:pPr>
+      <w:bookmarkStart w:id="8" w:name="_4mssgf4l9fqw" w:colFirst="0" w:colLast="0"/>
+      <w:bookmarkEnd w:id="8"/>
     </w:p>
     <w:tbl>
       <w:tblPr>
@@ -5260,23 +5262,7 @@
                 <w:sz w:val="24"/>
                 <w:szCs w:val="24"/>
               </w:rPr>
-              <w:t xml:space="preserve"> A </w:t>
-            </w:r>
-            <w:proofErr w:type="gramStart"/>
-            <w:r>
-              <w:rPr>
-                <w:sz w:val="24"/>
-                <w:szCs w:val="24"/>
-              </w:rPr>
-              <w:t>data informado</w:t>
-            </w:r>
-            <w:proofErr w:type="gramEnd"/>
-            <w:r>
-              <w:rPr>
-                <w:sz w:val="24"/>
-                <w:szCs w:val="24"/>
-              </w:rPr>
-              <w:t xml:space="preserve"> pelo professor deve ser maior ou igual a data corrente.</w:t>
+              <w:t xml:space="preserve"> A data informado pelo professor deve ser maior ou igual a data corrente.</w:t>
             </w:r>
           </w:p>
         </w:tc>
@@ -12024,8 +12010,8 @@
           <w:i/>
         </w:rPr>
       </w:pPr>
-      <w:bookmarkStart w:id="8" w:name="_q2dog5jlqn4l" w:colFirst="0" w:colLast="0"/>
-      <w:bookmarkEnd w:id="8"/>
+      <w:bookmarkStart w:id="9" w:name="_q2dog5jlqn4l" w:colFirst="0" w:colLast="0"/>
+      <w:bookmarkEnd w:id="9"/>
     </w:p>
     <w:p>
       <w:pPr>
@@ -12629,8 +12615,8 @@
       <w:pPr>
         <w:jc w:val="both"/>
       </w:pPr>
-      <w:bookmarkStart w:id="9" w:name="_2wyw9agifa30" w:colFirst="0" w:colLast="0"/>
-      <w:bookmarkEnd w:id="9"/>
+      <w:bookmarkStart w:id="10" w:name="_2wyw9agifa30" w:colFirst="0" w:colLast="0"/>
+      <w:bookmarkEnd w:id="10"/>
       <w:r>
         <w:br w:type="page"/>
       </w:r>
@@ -12658,8 +12644,8 @@
           <w:szCs w:val="22"/>
         </w:rPr>
       </w:pPr>
-      <w:bookmarkStart w:id="10" w:name="_sbslgv21jk5a" w:colFirst="0" w:colLast="0"/>
-      <w:bookmarkEnd w:id="10"/>
+      <w:bookmarkStart w:id="11" w:name="_sbslgv21jk5a" w:colFirst="0" w:colLast="0"/>
+      <w:bookmarkEnd w:id="11"/>
       <w:r>
         <w:rPr>
           <w:b/>
@@ -12706,7 +12692,7 @@
                     </pic:cNvPicPr>
                   </pic:nvPicPr>
                   <pic:blipFill>
-                    <a:blip r:embed="rId8" cstate="print">
+                    <a:blip r:embed="rId10" cstate="print">
                       <a:extLst>
                         <a:ext uri="{28A0092B-C50C-407E-A947-70E740481C1C}">
                           <a14:useLocalDpi xmlns:a14="http://schemas.microsoft.com/office/drawing/2010/main" val="0"/>
@@ -12757,8 +12743,8 @@
           <w:szCs w:val="22"/>
         </w:rPr>
       </w:pPr>
-      <w:bookmarkStart w:id="11" w:name="_nk1gwtojkdso" w:colFirst="0" w:colLast="0"/>
-      <w:bookmarkEnd w:id="11"/>
+      <w:bookmarkStart w:id="12" w:name="_nk1gwtojkdso" w:colFirst="0" w:colLast="0"/>
+      <w:bookmarkEnd w:id="12"/>
       <w:r>
         <w:rPr>
           <w:b/>
@@ -13926,8 +13912,8 @@
           <w:szCs w:val="26"/>
         </w:rPr>
       </w:pPr>
-      <w:bookmarkStart w:id="12" w:name="_h1wz8fpnjy72" w:colFirst="0" w:colLast="0"/>
-      <w:bookmarkEnd w:id="12"/>
+      <w:bookmarkStart w:id="13" w:name="_h1wz8fpnjy72" w:colFirst="0" w:colLast="0"/>
+      <w:bookmarkEnd w:id="13"/>
       <w:r>
         <w:rPr>
           <w:b/>
@@ -13986,7 +13972,7 @@
                     </pic:cNvPicPr>
                   </pic:nvPicPr>
                   <pic:blipFill>
-                    <a:blip r:embed="rId9" cstate="print">
+                    <a:blip r:embed="rId11" cstate="print">
                       <a:extLst>
                         <a:ext uri="{28A0092B-C50C-407E-A947-70E740481C1C}">
                           <a14:useLocalDpi xmlns:a14="http://schemas.microsoft.com/office/drawing/2010/main" val="0"/>
@@ -14066,7 +14052,7 @@
                     <pic:cNvPicPr preferRelativeResize="0"/>
                   </pic:nvPicPr>
                   <pic:blipFill>
-                    <a:blip r:embed="rId10"/>
+                    <a:blip r:embed="rId12"/>
                     <a:srcRect/>
                     <a:stretch>
                       <a:fillRect/>
@@ -14170,7 +14156,7 @@
                     <pic:cNvPicPr preferRelativeResize="0"/>
                   </pic:nvPicPr>
                   <pic:blipFill>
-                    <a:blip r:embed="rId11"/>
+                    <a:blip r:embed="rId13"/>
                     <a:srcRect/>
                     <a:stretch>
                       <a:fillRect/>
@@ -14229,7 +14215,7 @@
                     <pic:cNvPicPr preferRelativeResize="0"/>
                   </pic:nvPicPr>
                   <pic:blipFill>
-                    <a:blip r:embed="rId12"/>
+                    <a:blip r:embed="rId14"/>
                     <a:srcRect b="36884"/>
                     <a:stretch>
                       <a:fillRect/>
@@ -14281,8 +14267,8 @@
           <w:szCs w:val="26"/>
         </w:rPr>
       </w:pPr>
-      <w:bookmarkStart w:id="13" w:name="_v0rd9kzhvf94" w:colFirst="0" w:colLast="0"/>
-      <w:bookmarkEnd w:id="13"/>
+      <w:bookmarkStart w:id="14" w:name="_v0rd9kzhvf94" w:colFirst="0" w:colLast="0"/>
+      <w:bookmarkEnd w:id="14"/>
       <w:r>
         <w:rPr>
           <w:b/>
@@ -14316,14 +14302,7 @@
           <w:rStyle w:val="Forte"/>
           <w:b w:val="0"/>
         </w:rPr>
-        <w:t xml:space="preserve">Figura </w:t>
-      </w:r>
-      <w:r>
-        <w:rPr>
-          <w:rStyle w:val="Forte"/>
-          <w:b w:val="0"/>
-        </w:rPr>
-        <w:t>1</w:t>
+        <w:t>Figura 1</w:t>
       </w:r>
       <w:r>
         <w:rPr>
@@ -14383,7 +14362,7 @@
                     <pic:cNvPicPr/>
                   </pic:nvPicPr>
                   <pic:blipFill>
-                    <a:blip r:embed="rId13"/>
+                    <a:blip r:embed="rId15"/>
                     <a:stretch>
                       <a:fillRect/>
                     </a:stretch>
@@ -14494,7 +14473,7 @@
                     <pic:cNvPicPr preferRelativeResize="0"/>
                   </pic:nvPicPr>
                   <pic:blipFill>
-                    <a:blip r:embed="rId14"/>
+                    <a:blip r:embed="rId16"/>
                     <a:stretch>
                       <a:fillRect/>
                     </a:stretch>
@@ -14621,7 +14600,7 @@
           <w:sz w:val="22"/>
           <w:szCs w:val="22"/>
         </w:rPr>
-        <w:t xml:space="preserve"> </w:t>
+        <w:t xml:space="preserve"> (Figura 7)</w:t>
       </w:r>
       <w:r>
         <w:rPr>
@@ -14630,7 +14609,7 @@
           <w:sz w:val="22"/>
           <w:szCs w:val="22"/>
         </w:rPr>
-        <w:t xml:space="preserve">(Figura </w:t>
+        <w:t>, detalhes das aulas (com nome do professor e horário)</w:t>
       </w:r>
       <w:r>
         <w:rPr>
@@ -14639,7 +14618,7 @@
           <w:sz w:val="22"/>
           <w:szCs w:val="22"/>
         </w:rPr>
-        <w:t>7</w:t>
+        <w:t xml:space="preserve"> (Figura 8)</w:t>
       </w:r>
       <w:r>
         <w:rPr>
@@ -14648,7 +14627,7 @@
           <w:sz w:val="22"/>
           <w:szCs w:val="22"/>
         </w:rPr>
-        <w:t>)</w:t>
+        <w:t>, e um canal direto de contato por mensagem com a secretaria da escola</w:t>
       </w:r>
       <w:r>
         <w:rPr>
@@ -14657,88 +14636,7 @@
           <w:sz w:val="22"/>
           <w:szCs w:val="22"/>
         </w:rPr>
-        <w:t>, detalhes das aulas (com nome do professor e horário)</w:t>
-      </w:r>
-      <w:r>
-        <w:rPr>
-          <w:rFonts w:eastAsia="Times New Roman"/>
-          <w:color w:val="auto"/>
-          <w:sz w:val="22"/>
-          <w:szCs w:val="22"/>
-        </w:rPr>
-        <w:t xml:space="preserve"> </w:t>
-      </w:r>
-      <w:r>
-        <w:rPr>
-          <w:rFonts w:eastAsia="Times New Roman"/>
-          <w:color w:val="auto"/>
-          <w:sz w:val="22"/>
-          <w:szCs w:val="22"/>
-        </w:rPr>
-        <w:t xml:space="preserve">(Figura </w:t>
-      </w:r>
-      <w:r>
-        <w:rPr>
-          <w:rFonts w:eastAsia="Times New Roman"/>
-          <w:color w:val="auto"/>
-          <w:sz w:val="22"/>
-          <w:szCs w:val="22"/>
-        </w:rPr>
-        <w:t>8</w:t>
-      </w:r>
-      <w:r>
-        <w:rPr>
-          <w:rFonts w:eastAsia="Times New Roman"/>
-          <w:color w:val="auto"/>
-          <w:sz w:val="22"/>
-          <w:szCs w:val="22"/>
-        </w:rPr>
-        <w:t>)</w:t>
-      </w:r>
-      <w:r>
-        <w:rPr>
-          <w:rFonts w:eastAsia="Times New Roman"/>
-          <w:color w:val="auto"/>
-          <w:sz w:val="22"/>
-          <w:szCs w:val="22"/>
-        </w:rPr>
-        <w:t>, e um canal direto de contato por mensagem com a secretaria da escola</w:t>
-      </w:r>
-      <w:r>
-        <w:rPr>
-          <w:rFonts w:eastAsia="Times New Roman"/>
-          <w:color w:val="auto"/>
-          <w:sz w:val="22"/>
-          <w:szCs w:val="22"/>
-        </w:rPr>
-        <w:t xml:space="preserve"> </w:t>
-      </w:r>
-      <w:r>
-        <w:rPr>
-          <w:rFonts w:eastAsia="Times New Roman"/>
-          <w:color w:val="auto"/>
-          <w:sz w:val="22"/>
-          <w:szCs w:val="22"/>
-        </w:rPr>
-        <w:t xml:space="preserve">(Figura </w:t>
-      </w:r>
-      <w:r>
-        <w:rPr>
-          <w:rFonts w:eastAsia="Times New Roman"/>
-          <w:color w:val="auto"/>
-          <w:sz w:val="22"/>
-          <w:szCs w:val="22"/>
-        </w:rPr>
-        <w:t>9</w:t>
-      </w:r>
-      <w:r>
-        <w:rPr>
-          <w:rFonts w:eastAsia="Times New Roman"/>
-          <w:color w:val="auto"/>
-          <w:sz w:val="22"/>
-          <w:szCs w:val="22"/>
-        </w:rPr>
-        <w:t>)</w:t>
+        <w:t xml:space="preserve"> (Figura 9)</w:t>
       </w:r>
       <w:r>
         <w:rPr>
@@ -14777,7 +14675,7 @@
                     </pic:cNvPicPr>
                   </pic:nvPicPr>
                   <pic:blipFill>
-                    <a:blip r:embed="rId15">
+                    <a:blip r:embed="rId17">
                       <a:extLst>
                         <a:ext uri="{28A0092B-C50C-407E-A947-70E740481C1C}">
                           <a14:useLocalDpi xmlns:a14="http://schemas.microsoft.com/office/drawing/2010/main" val="0"/>
@@ -14847,7 +14745,7 @@
                     </pic:cNvPicPr>
                   </pic:nvPicPr>
                   <pic:blipFill>
-                    <a:blip r:embed="rId16" cstate="print">
+                    <a:blip r:embed="rId18" cstate="print">
                       <a:extLst>
                         <a:ext uri="{28A0092B-C50C-407E-A947-70E740481C1C}">
                           <a14:useLocalDpi xmlns:a14="http://schemas.microsoft.com/office/drawing/2010/main" val="0"/>
@@ -14884,13 +14782,7 @@
         <w:jc w:val="center"/>
       </w:pPr>
       <w:r>
-        <w:t xml:space="preserve">Figura </w:t>
-      </w:r>
-      <w:r>
-        <w:t>4</w:t>
-      </w:r>
-      <w:r>
-        <w:t xml:space="preserve"> - </w:t>
+        <w:t xml:space="preserve">Figura 4 - </w:t>
       </w:r>
       <w:r>
         <w:t>Tela inicial do aluno</w:t>
@@ -14927,7 +14819,7 @@
                     </pic:cNvPicPr>
                   </pic:nvPicPr>
                   <pic:blipFill>
-                    <a:blip r:embed="rId17" cstate="print">
+                    <a:blip r:embed="rId19" cstate="print">
                       <a:extLst>
                         <a:ext uri="{28A0092B-C50C-407E-A947-70E740481C1C}">
                           <a14:useLocalDpi xmlns:a14="http://schemas.microsoft.com/office/drawing/2010/main" val="0"/>
@@ -14996,123 +14888,6 @@
                     <pic:cNvPicPr preferRelativeResize="0"/>
                   </pic:nvPicPr>
                   <pic:blipFill>
-                    <a:blip r:embed="rId18"/>
-                    <a:stretch>
-                      <a:fillRect/>
-                    </a:stretch>
-                  </pic:blipFill>
-                  <pic:spPr>
-                    <a:xfrm>
-                      <a:off x="0" y="0"/>
-                      <a:ext cx="5400000" cy="2520000"/>
-                    </a:xfrm>
-                    <a:prstGeom prst="rect">
-                      <a:avLst/>
-                    </a:prstGeom>
-                  </pic:spPr>
-                </pic:pic>
-              </a:graphicData>
-            </a:graphic>
-          </wp:inline>
-        </w:drawing>
-      </w:r>
-    </w:p>
-    <w:p>
-      <w:pPr>
-        <w:jc w:val="center"/>
-      </w:pPr>
-      <w:r>
-        <w:t>Figura 6 – Tela de frequência do aluno</w:t>
-      </w:r>
-    </w:p>
-    <w:p>
-      <w:pPr>
-        <w:jc w:val="center"/>
-      </w:pPr>
-    </w:p>
-    <w:p>
-      <w:pPr>
-        <w:jc w:val="center"/>
-      </w:pPr>
-      <w:r>
-        <w:rPr>
-          <w:noProof/>
-        </w:rPr>
-        <w:lastRenderedPageBreak/>
-        <w:drawing>
-          <wp:inline distT="0" distB="0" distL="0" distR="0" wp14:anchorId="0409B460" wp14:editId="42FEDF33">
-            <wp:extent cx="5400000" cy="2520000"/>
-            <wp:effectExtent l="0" t="0" r="0" b="0"/>
-            <wp:docPr id="8" name="Imagem 8"/>
-            <wp:cNvGraphicFramePr>
-              <a:graphicFrameLocks xmlns:a="http://schemas.openxmlformats.org/drawingml/2006/main"/>
-            </wp:cNvGraphicFramePr>
-            <a:graphic xmlns:a="http://schemas.openxmlformats.org/drawingml/2006/main">
-              <a:graphicData uri="http://schemas.openxmlformats.org/drawingml/2006/picture">
-                <pic:pic xmlns:pic="http://schemas.openxmlformats.org/drawingml/2006/picture">
-                  <pic:nvPicPr>
-                    <pic:cNvPr id="1" name=""/>
-                    <pic:cNvPicPr preferRelativeResize="0"/>
-                  </pic:nvPicPr>
-                  <pic:blipFill>
-                    <a:blip r:embed="rId19"/>
-                    <a:stretch>
-                      <a:fillRect/>
-                    </a:stretch>
-                  </pic:blipFill>
-                  <pic:spPr>
-                    <a:xfrm>
-                      <a:off x="0" y="0"/>
-                      <a:ext cx="5400000" cy="2520000"/>
-                    </a:xfrm>
-                    <a:prstGeom prst="rect">
-                      <a:avLst/>
-                    </a:prstGeom>
-                  </pic:spPr>
-                </pic:pic>
-              </a:graphicData>
-            </a:graphic>
-          </wp:inline>
-        </w:drawing>
-      </w:r>
-    </w:p>
-    <w:p>
-      <w:pPr>
-        <w:jc w:val="center"/>
-      </w:pPr>
-      <w:r>
-        <w:t>Figura 7 – Tela de notas do aluno</w:t>
-      </w:r>
-    </w:p>
-    <w:p>
-      <w:pPr>
-        <w:jc w:val="center"/>
-      </w:pPr>
-    </w:p>
-    <w:p>
-      <w:pPr>
-        <w:jc w:val="center"/>
-      </w:pPr>
-      <w:r>
-        <w:rPr>
-          <w:noProof/>
-        </w:rPr>
-        <w:drawing>
-          <wp:inline distT="0" distB="0" distL="0" distR="0" wp14:anchorId="648377BA" wp14:editId="7672D99E">
-            <wp:extent cx="5400000" cy="2520000"/>
-            <wp:effectExtent l="0" t="0" r="0" b="0"/>
-            <wp:docPr id="9" name="Imagem 9"/>
-            <wp:cNvGraphicFramePr>
-              <a:graphicFrameLocks xmlns:a="http://schemas.openxmlformats.org/drawingml/2006/main"/>
-            </wp:cNvGraphicFramePr>
-            <a:graphic xmlns:a="http://schemas.openxmlformats.org/drawingml/2006/main">
-              <a:graphicData uri="http://schemas.openxmlformats.org/drawingml/2006/picture">
-                <pic:pic xmlns:pic="http://schemas.openxmlformats.org/drawingml/2006/picture">
-                  <pic:nvPicPr>
-                    <pic:cNvPr id="1" name=""/>
-                    <pic:cNvPicPr/>
-                  </pic:nvPicPr>
-                  <pic:blipFill>
                     <a:blip r:embed="rId20"/>
                     <a:stretch>
                       <a:fillRect/>
@@ -15139,7 +14914,7 @@
         <w:jc w:val="center"/>
       </w:pPr>
       <w:r>
-        <w:t>Figura 8 – Tela das aulas do aluno.</w:t>
+        <w:t>Figura 6 – Tela de frequência do aluno</w:t>
       </w:r>
     </w:p>
     <w:p>
@@ -15155,11 +14930,12 @@
         <w:rPr>
           <w:noProof/>
         </w:rPr>
+        <w:lastRenderedPageBreak/>
         <w:drawing>
-          <wp:inline distT="0" distB="0" distL="0" distR="0" wp14:anchorId="31FFDED5" wp14:editId="1A846D42">
+          <wp:inline distT="0" distB="0" distL="0" distR="0" wp14:anchorId="0409B460" wp14:editId="42FEDF33">
             <wp:extent cx="5400000" cy="2520000"/>
             <wp:effectExtent l="0" t="0" r="0" b="0"/>
-            <wp:docPr id="15" name="Imagem 15"/>
+            <wp:docPr id="8" name="Imagem 8"/>
             <wp:cNvGraphicFramePr>
               <a:graphicFrameLocks xmlns:a="http://schemas.openxmlformats.org/drawingml/2006/main"/>
             </wp:cNvGraphicFramePr>
@@ -15197,6 +14973,122 @@
         <w:jc w:val="center"/>
       </w:pPr>
       <w:r>
+        <w:t>Figura 7 – Tela de notas do aluno</w:t>
+      </w:r>
+    </w:p>
+    <w:p>
+      <w:pPr>
+        <w:jc w:val="center"/>
+      </w:pPr>
+    </w:p>
+    <w:p>
+      <w:pPr>
+        <w:jc w:val="center"/>
+      </w:pPr>
+      <w:r>
+        <w:rPr>
+          <w:noProof/>
+        </w:rPr>
+        <w:drawing>
+          <wp:inline distT="0" distB="0" distL="0" distR="0" wp14:anchorId="648377BA" wp14:editId="7672D99E">
+            <wp:extent cx="5400000" cy="2520000"/>
+            <wp:effectExtent l="0" t="0" r="0" b="0"/>
+            <wp:docPr id="9" name="Imagem 9"/>
+            <wp:cNvGraphicFramePr>
+              <a:graphicFrameLocks xmlns:a="http://schemas.openxmlformats.org/drawingml/2006/main"/>
+            </wp:cNvGraphicFramePr>
+            <a:graphic xmlns:a="http://schemas.openxmlformats.org/drawingml/2006/main">
+              <a:graphicData uri="http://schemas.openxmlformats.org/drawingml/2006/picture">
+                <pic:pic xmlns:pic="http://schemas.openxmlformats.org/drawingml/2006/picture">
+                  <pic:nvPicPr>
+                    <pic:cNvPr id="1" name=""/>
+                    <pic:cNvPicPr/>
+                  </pic:nvPicPr>
+                  <pic:blipFill>
+                    <a:blip r:embed="rId22"/>
+                    <a:stretch>
+                      <a:fillRect/>
+                    </a:stretch>
+                  </pic:blipFill>
+                  <pic:spPr>
+                    <a:xfrm>
+                      <a:off x="0" y="0"/>
+                      <a:ext cx="5400000" cy="2520000"/>
+                    </a:xfrm>
+                    <a:prstGeom prst="rect">
+                      <a:avLst/>
+                    </a:prstGeom>
+                  </pic:spPr>
+                </pic:pic>
+              </a:graphicData>
+            </a:graphic>
+          </wp:inline>
+        </w:drawing>
+      </w:r>
+    </w:p>
+    <w:p>
+      <w:pPr>
+        <w:jc w:val="center"/>
+      </w:pPr>
+      <w:r>
+        <w:t>Figura 8 – Tela das aulas do aluno.</w:t>
+      </w:r>
+    </w:p>
+    <w:p>
+      <w:pPr>
+        <w:jc w:val="center"/>
+      </w:pPr>
+    </w:p>
+    <w:p>
+      <w:pPr>
+        <w:jc w:val="center"/>
+      </w:pPr>
+      <w:r>
+        <w:rPr>
+          <w:noProof/>
+        </w:rPr>
+        <w:drawing>
+          <wp:inline distT="0" distB="0" distL="0" distR="0" wp14:anchorId="31FFDED5" wp14:editId="1A846D42">
+            <wp:extent cx="5400000" cy="2520000"/>
+            <wp:effectExtent l="0" t="0" r="0" b="0"/>
+            <wp:docPr id="15" name="Imagem 15"/>
+            <wp:cNvGraphicFramePr>
+              <a:graphicFrameLocks xmlns:a="http://schemas.openxmlformats.org/drawingml/2006/main"/>
+            </wp:cNvGraphicFramePr>
+            <a:graphic xmlns:a="http://schemas.openxmlformats.org/drawingml/2006/main">
+              <a:graphicData uri="http://schemas.openxmlformats.org/drawingml/2006/picture">
+                <pic:pic xmlns:pic="http://schemas.openxmlformats.org/drawingml/2006/picture">
+                  <pic:nvPicPr>
+                    <pic:cNvPr id="1" name=""/>
+                    <pic:cNvPicPr preferRelativeResize="0"/>
+                  </pic:nvPicPr>
+                  <pic:blipFill>
+                    <a:blip r:embed="rId23"/>
+                    <a:stretch>
+                      <a:fillRect/>
+                    </a:stretch>
+                  </pic:blipFill>
+                  <pic:spPr>
+                    <a:xfrm>
+                      <a:off x="0" y="0"/>
+                      <a:ext cx="5400000" cy="2520000"/>
+                    </a:xfrm>
+                    <a:prstGeom prst="rect">
+                      <a:avLst/>
+                    </a:prstGeom>
+                  </pic:spPr>
+                </pic:pic>
+              </a:graphicData>
+            </a:graphic>
+          </wp:inline>
+        </w:drawing>
+      </w:r>
+    </w:p>
+    <w:p>
+      <w:pPr>
+        <w:jc w:val="center"/>
+      </w:pPr>
+      <w:r>
         <w:t xml:space="preserve">Figura 9 – Tela de contato com a secretaria </w:t>
       </w:r>
       <w:r>
@@ -15277,7 +15169,7 @@
                     </pic:cNvPicPr>
                   </pic:nvPicPr>
                   <pic:blipFill>
-                    <a:blip r:embed="rId22" cstate="print">
+                    <a:blip r:embed="rId24" cstate="print">
                       <a:extLst>
                         <a:ext uri="{28A0092B-C50C-407E-A947-70E740481C1C}">
                           <a14:useLocalDpi xmlns:a14="http://schemas.microsoft.com/office/drawing/2010/main" val="0"/>
@@ -15352,172 +15244,6 @@
                     <pic:cNvPicPr preferRelativeResize="0"/>
                   </pic:nvPicPr>
                   <pic:blipFill>
-                    <a:blip r:embed="rId23"/>
-                    <a:stretch>
-                      <a:fillRect/>
-                    </a:stretch>
-                  </pic:blipFill>
-                  <pic:spPr>
-                    <a:xfrm>
-                      <a:off x="0" y="0"/>
-                      <a:ext cx="5400000" cy="2520000"/>
-                    </a:xfrm>
-                    <a:prstGeom prst="rect">
-                      <a:avLst/>
-                    </a:prstGeom>
-                  </pic:spPr>
-                </pic:pic>
-              </a:graphicData>
-            </a:graphic>
-          </wp:inline>
-        </w:drawing>
-      </w:r>
-    </w:p>
-    <w:p>
-      <w:pPr>
-        <w:jc w:val="center"/>
-      </w:pPr>
-      <w:r>
-        <w:t xml:space="preserve">Figura </w:t>
-      </w:r>
-      <w:r>
-        <w:t>11</w:t>
-      </w:r>
-      <w:r>
-        <w:t xml:space="preserve"> - </w:t>
-      </w:r>
-      <w:r>
-        <w:t>Tela gerenciamento de turma do professor</w:t>
-      </w:r>
-    </w:p>
-    <w:p>
-      <w:pPr>
-        <w:jc w:val="center"/>
-      </w:pPr>
-    </w:p>
-    <w:p>
-      <w:pPr>
-        <w:jc w:val="center"/>
-      </w:pPr>
-    </w:p>
-    <w:p>
-      <w:pPr>
-        <w:jc w:val="center"/>
-      </w:pPr>
-      <w:r>
-        <w:rPr>
-          <w:noProof/>
-        </w:rPr>
-        <w:lastRenderedPageBreak/>
-        <w:drawing>
-          <wp:inline distT="0" distB="0" distL="0" distR="0" wp14:anchorId="3829B53D" wp14:editId="35E22B1A">
-            <wp:extent cx="5400000" cy="2520000"/>
-            <wp:effectExtent l="0" t="0" r="0" b="0"/>
-            <wp:docPr id="1587927568" name="Imagem 1" descr="Interface gráfica do usuário, Aplicativo, Site&#10;&#10;O conteúdo gerado por IA pode estar incorreto."/>
-            <wp:cNvGraphicFramePr>
-              <a:graphicFrameLocks xmlns:a="http://schemas.openxmlformats.org/drawingml/2006/main"/>
-            </wp:cNvGraphicFramePr>
-            <a:graphic xmlns:a="http://schemas.openxmlformats.org/drawingml/2006/main">
-              <a:graphicData uri="http://schemas.openxmlformats.org/drawingml/2006/picture">
-                <pic:pic xmlns:pic="http://schemas.openxmlformats.org/drawingml/2006/picture">
-                  <pic:nvPicPr>
-                    <pic:cNvPr id="1587927568" name="Imagem 1" descr="Interface gráfica do usuário, Aplicativo, Site&#10;&#10;O conteúdo gerado por IA pode estar incorreto."/>
-                    <pic:cNvPicPr preferRelativeResize="0"/>
-                  </pic:nvPicPr>
-                  <pic:blipFill>
-                    <a:blip r:embed="rId24"/>
-                    <a:stretch>
-                      <a:fillRect/>
-                    </a:stretch>
-                  </pic:blipFill>
-                  <pic:spPr>
-                    <a:xfrm>
-                      <a:off x="0" y="0"/>
-                      <a:ext cx="5400000" cy="2520000"/>
-                    </a:xfrm>
-                    <a:prstGeom prst="rect">
-                      <a:avLst/>
-                    </a:prstGeom>
-                  </pic:spPr>
-                </pic:pic>
-              </a:graphicData>
-            </a:graphic>
-          </wp:inline>
-        </w:drawing>
-      </w:r>
-    </w:p>
-    <w:p>
-      <w:pPr>
-        <w:jc w:val="center"/>
-        <w:rPr>
-          <w:bCs/>
-        </w:rPr>
-      </w:pPr>
-      <w:r>
-        <w:rPr>
-          <w:bCs/>
-        </w:rPr>
-        <w:t xml:space="preserve">Figura </w:t>
-      </w:r>
-      <w:r>
-        <w:rPr>
-          <w:bCs/>
-        </w:rPr>
-        <w:t>12</w:t>
-      </w:r>
-      <w:r>
-        <w:rPr>
-          <w:bCs/>
-        </w:rPr>
-        <w:t xml:space="preserve"> - </w:t>
-      </w:r>
-      <w:r>
-        <w:rPr>
-          <w:bCs/>
-        </w:rPr>
-        <w:t>Tela gerenciamento de turma do professor (Registro de Frequência</w:t>
-      </w:r>
-      <w:r>
-        <w:rPr>
-          <w:bCs/>
-        </w:rPr>
-        <w:t>)</w:t>
-      </w:r>
-    </w:p>
-    <w:p>
-      <w:pPr>
-        <w:jc w:val="center"/>
-      </w:pPr>
-    </w:p>
-    <w:p>
-      <w:pPr>
-        <w:jc w:val="center"/>
-      </w:pPr>
-    </w:p>
-    <w:p>
-      <w:pPr>
-        <w:jc w:val="center"/>
-      </w:pPr>
-      <w:r>
-        <w:rPr>
-          <w:noProof/>
-        </w:rPr>
-        <w:drawing>
-          <wp:inline distT="0" distB="0" distL="0" distR="0" wp14:anchorId="3FEF31C7" wp14:editId="5C08A201">
-            <wp:extent cx="5400000" cy="2520000"/>
-            <wp:effectExtent l="0" t="0" r="0" b="0"/>
-            <wp:docPr id="1993379881" name="Imagem 1" descr="Interface gráfica do usuário, Aplicativo&#10;&#10;O conteúdo gerado por IA pode estar incorreto."/>
-            <wp:cNvGraphicFramePr>
-              <a:graphicFrameLocks xmlns:a="http://schemas.openxmlformats.org/drawingml/2006/main"/>
-            </wp:cNvGraphicFramePr>
-            <a:graphic xmlns:a="http://schemas.openxmlformats.org/drawingml/2006/main">
-              <a:graphicData uri="http://schemas.openxmlformats.org/drawingml/2006/picture">
-                <pic:pic xmlns:pic="http://schemas.openxmlformats.org/drawingml/2006/picture">
-                  <pic:nvPicPr>
-                    <pic:cNvPr id="1993379881" name="Imagem 1" descr="Interface gráfica do usuário, Aplicativo&#10;&#10;O conteúdo gerado por IA pode estar incorreto."/>
-                    <pic:cNvPicPr preferRelativeResize="0"/>
-                  </pic:nvPicPr>
-                  <pic:blipFill>
                     <a:blip r:embed="rId25"/>
                     <a:stretch>
                       <a:fillRect/>
@@ -15542,56 +15268,41 @@
     <w:p>
       <w:pPr>
         <w:jc w:val="center"/>
-        <w:rPr>
-          <w:bCs/>
-        </w:rPr>
-      </w:pPr>
-      <w:r>
-        <w:rPr>
-          <w:bCs/>
-        </w:rPr>
+      </w:pPr>
+      <w:r>
         <w:t xml:space="preserve">Figura </w:t>
       </w:r>
       <w:r>
-        <w:rPr>
-          <w:bCs/>
-        </w:rPr>
-        <w:t>13</w:t>
-      </w:r>
-      <w:r>
-        <w:rPr>
-          <w:bCs/>
-        </w:rPr>
-        <w:t xml:space="preserve"> - </w:t>
-      </w:r>
-      <w:r>
-        <w:rPr>
-          <w:bCs/>
-        </w:rPr>
-        <w:t>Tela gerenciamento de turma do professor (Planejamento de Aula)</w:t>
+        <w:t>11</w:t>
+      </w:r>
+      <w:r>
+        <w:t xml:space="preserve"> - Tela gerenciamento de turma do professor</w:t>
       </w:r>
     </w:p>
     <w:p>
       <w:pPr>
         <w:jc w:val="center"/>
-        <w:rPr>
-          <w:b/>
-        </w:rPr>
       </w:pPr>
     </w:p>
     <w:p>
       <w:pPr>
         <w:jc w:val="center"/>
       </w:pPr>
+    </w:p>
+    <w:p>
+      <w:pPr>
+        <w:jc w:val="center"/>
+      </w:pPr>
       <w:r>
         <w:rPr>
           <w:noProof/>
         </w:rPr>
+        <w:lastRenderedPageBreak/>
         <w:drawing>
-          <wp:inline distT="0" distB="0" distL="0" distR="0" wp14:anchorId="6BD60855" wp14:editId="3C2C12CD">
+          <wp:inline distT="0" distB="0" distL="0" distR="0" wp14:anchorId="3829B53D" wp14:editId="35E22B1A">
             <wp:extent cx="5400000" cy="2520000"/>
             <wp:effectExtent l="0" t="0" r="0" b="0"/>
-            <wp:docPr id="16" name="Imagem 16"/>
+            <wp:docPr id="1587927568" name="Imagem 1" descr="Interface gráfica do usuário, Aplicativo, Site&#10;&#10;O conteúdo gerado por IA pode estar incorreto."/>
             <wp:cNvGraphicFramePr>
               <a:graphicFrameLocks xmlns:a="http://schemas.openxmlformats.org/drawingml/2006/main"/>
             </wp:cNvGraphicFramePr>
@@ -15599,7 +15310,7 @@
               <a:graphicData uri="http://schemas.openxmlformats.org/drawingml/2006/picture">
                 <pic:pic xmlns:pic="http://schemas.openxmlformats.org/drawingml/2006/picture">
                   <pic:nvPicPr>
-                    <pic:cNvPr id="1" name=""/>
+                    <pic:cNvPr id="1587927568" name="Imagem 1" descr="Interface gráfica do usuário, Aplicativo, Site&#10;&#10;O conteúdo gerado por IA pode estar incorreto."/>
                     <pic:cNvPicPr preferRelativeResize="0"/>
                   </pic:nvPicPr>
                   <pic:blipFill>
@@ -15627,9 +15338,33 @@
     <w:p>
       <w:pPr>
         <w:jc w:val="center"/>
-      </w:pPr>
-      <w:r>
-        <w:t>Figura 14 – Tela de Avisos do professor</w:t>
+        <w:rPr>
+          <w:bCs/>
+        </w:rPr>
+      </w:pPr>
+      <w:r>
+        <w:rPr>
+          <w:bCs/>
+        </w:rPr>
+        <w:t xml:space="preserve">Figura </w:t>
+      </w:r>
+      <w:r>
+        <w:rPr>
+          <w:bCs/>
+        </w:rPr>
+        <w:t>12</w:t>
+      </w:r>
+      <w:r>
+        <w:rPr>
+          <w:bCs/>
+        </w:rPr>
+        <w:t xml:space="preserve"> - Tela gerenciamento de turma do professor (Registro de Frequência</w:t>
+      </w:r>
+      <w:r>
+        <w:rPr>
+          <w:bCs/>
+        </w:rPr>
+        <w:t>)</w:t>
       </w:r>
     </w:p>
     <w:p>
@@ -15641,15 +15376,20 @@
       <w:pPr>
         <w:jc w:val="center"/>
       </w:pPr>
+    </w:p>
+    <w:p>
+      <w:pPr>
+        <w:jc w:val="center"/>
+      </w:pPr>
       <w:r>
         <w:rPr>
           <w:noProof/>
         </w:rPr>
         <w:drawing>
-          <wp:inline distT="0" distB="0" distL="0" distR="0" wp14:anchorId="533F55FA" wp14:editId="557DFE1B">
+          <wp:inline distT="0" distB="0" distL="0" distR="0" wp14:anchorId="3FEF31C7" wp14:editId="5C08A201">
             <wp:extent cx="5400000" cy="2520000"/>
             <wp:effectExtent l="0" t="0" r="0" b="0"/>
-            <wp:docPr id="18" name="Imagem 18"/>
+            <wp:docPr id="1993379881" name="Imagem 1" descr="Interface gráfica do usuário, Aplicativo&#10;&#10;O conteúdo gerado por IA pode estar incorreto."/>
             <wp:cNvGraphicFramePr>
               <a:graphicFrameLocks xmlns:a="http://schemas.openxmlformats.org/drawingml/2006/main"/>
             </wp:cNvGraphicFramePr>
@@ -15657,7 +15397,7 @@
               <a:graphicData uri="http://schemas.openxmlformats.org/drawingml/2006/picture">
                 <pic:pic xmlns:pic="http://schemas.openxmlformats.org/drawingml/2006/picture">
                   <pic:nvPicPr>
-                    <pic:cNvPr id="1" name=""/>
+                    <pic:cNvPr id="1993379881" name="Imagem 1" descr="Interface gráfica do usuário, Aplicativo&#10;&#10;O conteúdo gerado por IA pode estar incorreto."/>
                     <pic:cNvPicPr preferRelativeResize="0"/>
                   </pic:nvPicPr>
                   <pic:blipFill>
@@ -15685,15 +15425,146 @@
     <w:p>
       <w:pPr>
         <w:jc w:val="center"/>
-      </w:pPr>
-      <w:r>
-        <w:t>Figura 1</w:t>
-      </w:r>
-      <w:r>
-        <w:t>5</w:t>
-      </w:r>
-      <w:r>
-        <w:t xml:space="preserve"> – Tela de Avisos do professor</w:t>
+        <w:rPr>
+          <w:bCs/>
+        </w:rPr>
+      </w:pPr>
+      <w:r>
+        <w:rPr>
+          <w:bCs/>
+        </w:rPr>
+        <w:t xml:space="preserve">Figura </w:t>
+      </w:r>
+      <w:r>
+        <w:rPr>
+          <w:bCs/>
+        </w:rPr>
+        <w:t>13</w:t>
+      </w:r>
+      <w:r>
+        <w:rPr>
+          <w:bCs/>
+        </w:rPr>
+        <w:t xml:space="preserve"> - Tela gerenciamento de turma do professor (Planejamento de Aula)</w:t>
+      </w:r>
+    </w:p>
+    <w:p>
+      <w:pPr>
+        <w:jc w:val="center"/>
+        <w:rPr>
+          <w:b/>
+        </w:rPr>
+      </w:pPr>
+    </w:p>
+    <w:p>
+      <w:pPr>
+        <w:jc w:val="center"/>
+      </w:pPr>
+      <w:r>
+        <w:rPr>
+          <w:noProof/>
+        </w:rPr>
+        <w:drawing>
+          <wp:inline distT="0" distB="0" distL="0" distR="0" wp14:anchorId="6BD60855" wp14:editId="3C2C12CD">
+            <wp:extent cx="5400000" cy="2520000"/>
+            <wp:effectExtent l="0" t="0" r="0" b="0"/>
+            <wp:docPr id="16" name="Imagem 16"/>
+            <wp:cNvGraphicFramePr>
+              <a:graphicFrameLocks xmlns:a="http://schemas.openxmlformats.org/drawingml/2006/main"/>
+            </wp:cNvGraphicFramePr>
+            <a:graphic xmlns:a="http://schemas.openxmlformats.org/drawingml/2006/main">
+              <a:graphicData uri="http://schemas.openxmlformats.org/drawingml/2006/picture">
+                <pic:pic xmlns:pic="http://schemas.openxmlformats.org/drawingml/2006/picture">
+                  <pic:nvPicPr>
+                    <pic:cNvPr id="1" name=""/>
+                    <pic:cNvPicPr preferRelativeResize="0"/>
+                  </pic:nvPicPr>
+                  <pic:blipFill>
+                    <a:blip r:embed="rId28"/>
+                    <a:stretch>
+                      <a:fillRect/>
+                    </a:stretch>
+                  </pic:blipFill>
+                  <pic:spPr>
+                    <a:xfrm>
+                      <a:off x="0" y="0"/>
+                      <a:ext cx="5400000" cy="2520000"/>
+                    </a:xfrm>
+                    <a:prstGeom prst="rect">
+                      <a:avLst/>
+                    </a:prstGeom>
+                  </pic:spPr>
+                </pic:pic>
+              </a:graphicData>
+            </a:graphic>
+          </wp:inline>
+        </w:drawing>
+      </w:r>
+    </w:p>
+    <w:p>
+      <w:pPr>
+        <w:jc w:val="center"/>
+      </w:pPr>
+      <w:r>
+        <w:t>Figura 14 – Tela de Avisos do professor</w:t>
+      </w:r>
+    </w:p>
+    <w:p>
+      <w:pPr>
+        <w:jc w:val="center"/>
+      </w:pPr>
+    </w:p>
+    <w:p>
+      <w:pPr>
+        <w:jc w:val="center"/>
+      </w:pPr>
+      <w:r>
+        <w:rPr>
+          <w:noProof/>
+        </w:rPr>
+        <w:drawing>
+          <wp:inline distT="0" distB="0" distL="0" distR="0" wp14:anchorId="533F55FA" wp14:editId="557DFE1B">
+            <wp:extent cx="5400000" cy="2520000"/>
+            <wp:effectExtent l="0" t="0" r="0" b="0"/>
+            <wp:docPr id="18" name="Imagem 18"/>
+            <wp:cNvGraphicFramePr>
+              <a:graphicFrameLocks xmlns:a="http://schemas.openxmlformats.org/drawingml/2006/main"/>
+            </wp:cNvGraphicFramePr>
+            <a:graphic xmlns:a="http://schemas.openxmlformats.org/drawingml/2006/main">
+              <a:graphicData uri="http://schemas.openxmlformats.org/drawingml/2006/picture">
+                <pic:pic xmlns:pic="http://schemas.openxmlformats.org/drawingml/2006/picture">
+                  <pic:nvPicPr>
+                    <pic:cNvPr id="1" name=""/>
+                    <pic:cNvPicPr preferRelativeResize="0"/>
+                  </pic:nvPicPr>
+                  <pic:blipFill>
+                    <a:blip r:embed="rId29"/>
+                    <a:stretch>
+                      <a:fillRect/>
+                    </a:stretch>
+                  </pic:blipFill>
+                  <pic:spPr>
+                    <a:xfrm>
+                      <a:off x="0" y="0"/>
+                      <a:ext cx="5400000" cy="2520000"/>
+                    </a:xfrm>
+                    <a:prstGeom prst="rect">
+                      <a:avLst/>
+                    </a:prstGeom>
+                  </pic:spPr>
+                </pic:pic>
+              </a:graphicData>
+            </a:graphic>
+          </wp:inline>
+        </w:drawing>
+      </w:r>
+    </w:p>
+    <w:p>
+      <w:pPr>
+        <w:jc w:val="center"/>
+      </w:pPr>
+      <w:r>
+        <w:t>Figura 15 – Tela de Avisos do professor</w:t>
       </w:r>
     </w:p>
     <w:p>
@@ -15733,7 +15604,7 @@
                     <pic:cNvPicPr preferRelativeResize="0"/>
                   </pic:nvPicPr>
                   <pic:blipFill>
-                    <a:blip r:embed="rId28">
+                    <a:blip r:embed="rId30">
                       <a:extLst>
                         <a:ext uri="{28A0092B-C50C-407E-A947-70E740481C1C}">
                           <a14:useLocalDpi xmlns:a14="http://schemas.microsoft.com/office/drawing/2010/main" val="0"/>
@@ -15765,6 +15636,881 @@
     </w:p>
     <w:p>
       <w:pPr>
+        <w:jc w:val="center"/>
+      </w:pPr>
+    </w:p>
+    <w:p>
+      <w:pPr>
+        <w:ind w:firstLine="720"/>
+        <w:jc w:val="both"/>
+      </w:pPr>
+      <w:r>
+        <w:t>Ao fazer login, o coordenador é recebido por uma tela inicial que exibe uma mensagem personalizada, uma consulta rápida e atalhos para as funcionalidades mais utilizadas, conforme a Figura 17. No cabeçalho, o menu oferece acesso à seção "Gestão" (Figura 18), onde o coordenador pode realizar o cadastro de funcionários, professores e alunos, além de efetuar buscas. O menu também dispõe da opção "Relatórios", que permite ao coordenador emitir diversos tipos de relatórios, conforme ilustrado nas Figuras 19, 20 e 21. Adicionalmente, os coordenadores podem enviar avisos diretamente para toda a comunidade acadêmica (Figuras 22 e 23).</w:t>
+      </w:r>
+    </w:p>
+    <w:p>
+      <w:pPr>
+        <w:ind w:firstLine="720"/>
+        <w:jc w:val="both"/>
+      </w:pPr>
+      <w:r>
+        <w:rPr>
+          <w:noProof/>
+        </w:rPr>
+        <w:lastRenderedPageBreak/>
+        <w:drawing>
+          <wp:inline distT="0" distB="0" distL="0" distR="0" wp14:anchorId="3CDA27E5" wp14:editId="3251FBA2">
+            <wp:extent cx="5400000" cy="2520000"/>
+            <wp:effectExtent l="0" t="0" r="0" b="0"/>
+            <wp:docPr id="17" name="Imagem 17"/>
+            <wp:cNvGraphicFramePr>
+              <a:graphicFrameLocks xmlns:a="http://schemas.openxmlformats.org/drawingml/2006/main"/>
+            </wp:cNvGraphicFramePr>
+            <a:graphic xmlns:a="http://schemas.openxmlformats.org/drawingml/2006/main">
+              <a:graphicData uri="http://schemas.openxmlformats.org/drawingml/2006/picture">
+                <pic:pic xmlns:pic="http://schemas.openxmlformats.org/drawingml/2006/picture">
+                  <pic:nvPicPr>
+                    <pic:cNvPr id="1" name=""/>
+                    <pic:cNvPicPr preferRelativeResize="0"/>
+                  </pic:nvPicPr>
+                  <pic:blipFill>
+                    <a:blip r:embed="rId31"/>
+                    <a:stretch>
+                      <a:fillRect/>
+                    </a:stretch>
+                  </pic:blipFill>
+                  <pic:spPr>
+                    <a:xfrm>
+                      <a:off x="0" y="0"/>
+                      <a:ext cx="5400000" cy="2520000"/>
+                    </a:xfrm>
+                    <a:prstGeom prst="rect">
+                      <a:avLst/>
+                    </a:prstGeom>
+                  </pic:spPr>
+                </pic:pic>
+              </a:graphicData>
+            </a:graphic>
+          </wp:inline>
+        </w:drawing>
+      </w:r>
+    </w:p>
+    <w:p>
+      <w:pPr>
+        <w:jc w:val="center"/>
+      </w:pPr>
+      <w:r>
+        <w:t>Tela 17 – Tela Inicial do Coordenador</w:t>
+      </w:r>
+    </w:p>
+    <w:p>
+      <w:pPr>
+        <w:jc w:val="center"/>
+      </w:pPr>
+    </w:p>
+    <w:p>
+      <w:pPr>
+        <w:jc w:val="center"/>
+      </w:pPr>
+      <w:r>
+        <w:rPr>
+          <w:noProof/>
+        </w:rPr>
+        <w:drawing>
+          <wp:inline distT="0" distB="0" distL="0" distR="0" wp14:anchorId="5D86AF09" wp14:editId="372C4E29">
+            <wp:extent cx="5400000" cy="2520000"/>
+            <wp:effectExtent l="0" t="0" r="0" b="0"/>
+            <wp:docPr id="20" name="Imagem 20"/>
+            <wp:cNvGraphicFramePr>
+              <a:graphicFrameLocks xmlns:a="http://schemas.openxmlformats.org/drawingml/2006/main"/>
+            </wp:cNvGraphicFramePr>
+            <a:graphic xmlns:a="http://schemas.openxmlformats.org/drawingml/2006/main">
+              <a:graphicData uri="http://schemas.openxmlformats.org/drawingml/2006/picture">
+                <pic:pic xmlns:pic="http://schemas.openxmlformats.org/drawingml/2006/picture">
+                  <pic:nvPicPr>
+                    <pic:cNvPr id="1" name=""/>
+                    <pic:cNvPicPr preferRelativeResize="0"/>
+                  </pic:nvPicPr>
+                  <pic:blipFill>
+                    <a:blip r:embed="rId32"/>
+                    <a:stretch>
+                      <a:fillRect/>
+                    </a:stretch>
+                  </pic:blipFill>
+                  <pic:spPr>
+                    <a:xfrm>
+                      <a:off x="0" y="0"/>
+                      <a:ext cx="5400000" cy="2520000"/>
+                    </a:xfrm>
+                    <a:prstGeom prst="rect">
+                      <a:avLst/>
+                    </a:prstGeom>
+                  </pic:spPr>
+                </pic:pic>
+              </a:graphicData>
+            </a:graphic>
+          </wp:inline>
+        </w:drawing>
+      </w:r>
+    </w:p>
+    <w:p>
+      <w:pPr>
+        <w:jc w:val="center"/>
+      </w:pPr>
+      <w:r>
+        <w:t>Figura 18 – Tela de Gestão do coordenador</w:t>
+      </w:r>
+    </w:p>
+    <w:p>
+      <w:pPr>
+        <w:jc w:val="center"/>
+      </w:pPr>
+    </w:p>
+    <w:p>
+      <w:pPr>
+        <w:jc w:val="center"/>
+      </w:pPr>
+      <w:r>
+        <w:rPr>
+          <w:noProof/>
+        </w:rPr>
+        <w:drawing>
+          <wp:inline distT="0" distB="0" distL="0" distR="0" wp14:anchorId="53267C9B" wp14:editId="0DC24F02">
+            <wp:extent cx="5400000" cy="2520000"/>
+            <wp:effectExtent l="0" t="0" r="0" b="0"/>
+            <wp:docPr id="21" name="Imagem 21"/>
+            <wp:cNvGraphicFramePr>
+              <a:graphicFrameLocks xmlns:a="http://schemas.openxmlformats.org/drawingml/2006/main"/>
+            </wp:cNvGraphicFramePr>
+            <a:graphic xmlns:a="http://schemas.openxmlformats.org/drawingml/2006/main">
+              <a:graphicData uri="http://schemas.openxmlformats.org/drawingml/2006/picture">
+                <pic:pic xmlns:pic="http://schemas.openxmlformats.org/drawingml/2006/picture">
+                  <pic:nvPicPr>
+                    <pic:cNvPr id="1" name=""/>
+                    <pic:cNvPicPr preferRelativeResize="0"/>
+                  </pic:nvPicPr>
+                  <pic:blipFill>
+                    <a:blip r:embed="rId33"/>
+                    <a:stretch>
+                      <a:fillRect/>
+                    </a:stretch>
+                  </pic:blipFill>
+                  <pic:spPr>
+                    <a:xfrm>
+                      <a:off x="0" y="0"/>
+                      <a:ext cx="5400000" cy="2520000"/>
+                    </a:xfrm>
+                    <a:prstGeom prst="rect">
+                      <a:avLst/>
+                    </a:prstGeom>
+                  </pic:spPr>
+                </pic:pic>
+              </a:graphicData>
+            </a:graphic>
+          </wp:inline>
+        </w:drawing>
+      </w:r>
+    </w:p>
+    <w:p>
+      <w:pPr>
+        <w:jc w:val="center"/>
+      </w:pPr>
+      <w:r>
+        <w:t>Figura 19 – Tela de emissão de relatórios</w:t>
+      </w:r>
+    </w:p>
+    <w:p>
+      <w:pPr>
+        <w:jc w:val="center"/>
+      </w:pPr>
+    </w:p>
+    <w:p>
+      <w:pPr>
+        <w:jc w:val="center"/>
+      </w:pPr>
+      <w:r>
+        <w:rPr>
+          <w:noProof/>
+        </w:rPr>
+        <w:lastRenderedPageBreak/>
+        <w:drawing>
+          <wp:inline distT="0" distB="0" distL="0" distR="0" wp14:anchorId="5A38F56F" wp14:editId="37FDBC29">
+            <wp:extent cx="5400000" cy="2520000"/>
+            <wp:effectExtent l="0" t="0" r="0" b="0"/>
+            <wp:docPr id="22" name="Imagem 22"/>
+            <wp:cNvGraphicFramePr>
+              <a:graphicFrameLocks xmlns:a="http://schemas.openxmlformats.org/drawingml/2006/main"/>
+            </wp:cNvGraphicFramePr>
+            <a:graphic xmlns:a="http://schemas.openxmlformats.org/drawingml/2006/main">
+              <a:graphicData uri="http://schemas.openxmlformats.org/drawingml/2006/picture">
+                <pic:pic xmlns:pic="http://schemas.openxmlformats.org/drawingml/2006/picture">
+                  <pic:nvPicPr>
+                    <pic:cNvPr id="1" name=""/>
+                    <pic:cNvPicPr preferRelativeResize="0"/>
+                  </pic:nvPicPr>
+                  <pic:blipFill>
+                    <a:blip r:embed="rId34"/>
+                    <a:stretch>
+                      <a:fillRect/>
+                    </a:stretch>
+                  </pic:blipFill>
+                  <pic:spPr>
+                    <a:xfrm>
+                      <a:off x="0" y="0"/>
+                      <a:ext cx="5400000" cy="2520000"/>
+                    </a:xfrm>
+                    <a:prstGeom prst="rect">
+                      <a:avLst/>
+                    </a:prstGeom>
+                  </pic:spPr>
+                </pic:pic>
+              </a:graphicData>
+            </a:graphic>
+          </wp:inline>
+        </w:drawing>
+      </w:r>
+    </w:p>
+    <w:p>
+      <w:pPr>
+        <w:jc w:val="center"/>
+      </w:pPr>
+      <w:r>
+        <w:t xml:space="preserve">Figura </w:t>
+      </w:r>
+      <w:r>
+        <w:t>20</w:t>
+      </w:r>
+      <w:r>
+        <w:t xml:space="preserve"> – Tela de emissão de relatórios</w:t>
+      </w:r>
+    </w:p>
+    <w:p>
+      <w:pPr>
+        <w:jc w:val="center"/>
+      </w:pPr>
+    </w:p>
+    <w:p>
+      <w:pPr>
+        <w:jc w:val="center"/>
+      </w:pPr>
+    </w:p>
+    <w:p>
+      <w:pPr>
+        <w:jc w:val="center"/>
+      </w:pPr>
+      <w:r>
+        <w:rPr>
+          <w:noProof/>
+        </w:rPr>
+        <w:drawing>
+          <wp:inline distT="0" distB="0" distL="0" distR="0" wp14:anchorId="44A3386A" wp14:editId="7DB915A5">
+            <wp:extent cx="5400000" cy="2520000"/>
+            <wp:effectExtent l="0" t="0" r="0" b="0"/>
+            <wp:docPr id="23" name="Imagem 23"/>
+            <wp:cNvGraphicFramePr>
+              <a:graphicFrameLocks xmlns:a="http://schemas.openxmlformats.org/drawingml/2006/main"/>
+            </wp:cNvGraphicFramePr>
+            <a:graphic xmlns:a="http://schemas.openxmlformats.org/drawingml/2006/main">
+              <a:graphicData uri="http://schemas.openxmlformats.org/drawingml/2006/picture">
+                <pic:pic xmlns:pic="http://schemas.openxmlformats.org/drawingml/2006/picture">
+                  <pic:nvPicPr>
+                    <pic:cNvPr id="1" name=""/>
+                    <pic:cNvPicPr preferRelativeResize="0"/>
+                  </pic:nvPicPr>
+                  <pic:blipFill>
+                    <a:blip r:embed="rId35"/>
+                    <a:stretch>
+                      <a:fillRect/>
+                    </a:stretch>
+                  </pic:blipFill>
+                  <pic:spPr>
+                    <a:xfrm>
+                      <a:off x="0" y="0"/>
+                      <a:ext cx="5400000" cy="2520000"/>
+                    </a:xfrm>
+                    <a:prstGeom prst="rect">
+                      <a:avLst/>
+                    </a:prstGeom>
+                  </pic:spPr>
+                </pic:pic>
+              </a:graphicData>
+            </a:graphic>
+          </wp:inline>
+        </w:drawing>
+      </w:r>
+    </w:p>
+    <w:p>
+      <w:pPr>
+        <w:jc w:val="center"/>
+      </w:pPr>
+      <w:r>
+        <w:t xml:space="preserve">Figura </w:t>
+      </w:r>
+      <w:r>
+        <w:t>21</w:t>
+      </w:r>
+      <w:r>
+        <w:t xml:space="preserve"> – Tela de emissão de relatórios</w:t>
+      </w:r>
+    </w:p>
+    <w:p>
+      <w:pPr>
+        <w:jc w:val="center"/>
+      </w:pPr>
+    </w:p>
+    <w:p>
+      <w:pPr>
+        <w:jc w:val="center"/>
+      </w:pPr>
+      <w:r>
+        <w:rPr>
+          <w:noProof/>
+        </w:rPr>
+        <w:drawing>
+          <wp:inline distT="0" distB="0" distL="0" distR="0" wp14:anchorId="4A01C52E" wp14:editId="269F0C9D">
+            <wp:extent cx="5400000" cy="2520000"/>
+            <wp:effectExtent l="0" t="0" r="0" b="0"/>
+            <wp:docPr id="24" name="Imagem 24"/>
+            <wp:cNvGraphicFramePr>
+              <a:graphicFrameLocks xmlns:a="http://schemas.openxmlformats.org/drawingml/2006/main"/>
+            </wp:cNvGraphicFramePr>
+            <a:graphic xmlns:a="http://schemas.openxmlformats.org/drawingml/2006/main">
+              <a:graphicData uri="http://schemas.openxmlformats.org/drawingml/2006/picture">
+                <pic:pic xmlns:pic="http://schemas.openxmlformats.org/drawingml/2006/picture">
+                  <pic:nvPicPr>
+                    <pic:cNvPr id="1" name=""/>
+                    <pic:cNvPicPr preferRelativeResize="0"/>
+                  </pic:nvPicPr>
+                  <pic:blipFill>
+                    <a:blip r:embed="rId36"/>
+                    <a:stretch>
+                      <a:fillRect/>
+                    </a:stretch>
+                  </pic:blipFill>
+                  <pic:spPr>
+                    <a:xfrm>
+                      <a:off x="0" y="0"/>
+                      <a:ext cx="5400000" cy="2520000"/>
+                    </a:xfrm>
+                    <a:prstGeom prst="rect">
+                      <a:avLst/>
+                    </a:prstGeom>
+                  </pic:spPr>
+                </pic:pic>
+              </a:graphicData>
+            </a:graphic>
+          </wp:inline>
+        </w:drawing>
+      </w:r>
+    </w:p>
+    <w:p>
+      <w:pPr>
+        <w:jc w:val="center"/>
+      </w:pPr>
+      <w:r>
+        <w:t xml:space="preserve">Figura </w:t>
+      </w:r>
+      <w:r>
+        <w:t>22</w:t>
+      </w:r>
+      <w:r>
+        <w:t xml:space="preserve"> – Tela </w:t>
+      </w:r>
+      <w:r>
+        <w:t>de avisos</w:t>
+      </w:r>
+    </w:p>
+    <w:p>
+      <w:pPr>
+        <w:jc w:val="center"/>
+      </w:pPr>
+    </w:p>
+    <w:p>
+      <w:pPr>
+        <w:jc w:val="center"/>
+      </w:pPr>
+      <w:r>
+        <w:rPr>
+          <w:noProof/>
+        </w:rPr>
+        <w:drawing>
+          <wp:inline distT="0" distB="0" distL="0" distR="0" wp14:anchorId="4FCCFB67" wp14:editId="77744DC4">
+            <wp:extent cx="5400000" cy="2520000"/>
+            <wp:effectExtent l="0" t="0" r="0" b="0"/>
+            <wp:docPr id="25" name="Imagem 25"/>
+            <wp:cNvGraphicFramePr>
+              <a:graphicFrameLocks xmlns:a="http://schemas.openxmlformats.org/drawingml/2006/main"/>
+            </wp:cNvGraphicFramePr>
+            <a:graphic xmlns:a="http://schemas.openxmlformats.org/drawingml/2006/main">
+              <a:graphicData uri="http://schemas.openxmlformats.org/drawingml/2006/picture">
+                <pic:pic xmlns:pic="http://schemas.openxmlformats.org/drawingml/2006/picture">
+                  <pic:nvPicPr>
+                    <pic:cNvPr id="1" name=""/>
+                    <pic:cNvPicPr preferRelativeResize="0"/>
+                  </pic:nvPicPr>
+                  <pic:blipFill>
+                    <a:blip r:embed="rId37"/>
+                    <a:stretch>
+                      <a:fillRect/>
+                    </a:stretch>
+                  </pic:blipFill>
+                  <pic:spPr>
+                    <a:xfrm>
+                      <a:off x="0" y="0"/>
+                      <a:ext cx="5400000" cy="2520000"/>
+                    </a:xfrm>
+                    <a:prstGeom prst="rect">
+                      <a:avLst/>
+                    </a:prstGeom>
+                  </pic:spPr>
+                </pic:pic>
+              </a:graphicData>
+            </a:graphic>
+          </wp:inline>
+        </w:drawing>
+      </w:r>
+    </w:p>
+    <w:p>
+      <w:pPr>
+        <w:jc w:val="center"/>
+      </w:pPr>
+      <w:r>
+        <w:t xml:space="preserve">Figura </w:t>
+      </w:r>
+      <w:r>
+        <w:t>23</w:t>
+      </w:r>
+      <w:r>
+        <w:t xml:space="preserve"> – Tela de</w:t>
+      </w:r>
+      <w:r>
+        <w:t xml:space="preserve"> avisos</w:t>
+      </w:r>
+    </w:p>
+    <w:p>
+      <w:pPr>
+        <w:jc w:val="center"/>
+      </w:pPr>
+    </w:p>
+    <w:p>
+      <w:pPr>
+        <w:ind w:firstLine="720"/>
+        <w:jc w:val="both"/>
+      </w:pPr>
+      <w:r>
+        <w:t>Ao acessar o sistema com seu login, o funcionário será recebido por uma tela inicial personalizada que, conforme ilustrado na Figura 24, exibe uma consulta rápida e atalhos para as funcionalidades mais frequentemente utilizadas. No cabeçalho, o menu de navegação oferece acesso direto a diversas seções. Uma delas é o "Cadastro de Usuário", onde é possível registrar novos professores, alunos e outros funcionários (Figuras 25 e 26). Adicionalmente, o menu inclui a opção de "Cadastro Acadêmico", que permite a inserção de novos cursos para a escola (Figura 27). Por fim, na "Biblioteca Virtual", o funcionário tem a capacidade de realizar o upload de materiais, disponibilizando-os para toda a comunidade acadêmica (Figuras 28 e 29).</w:t>
+      </w:r>
+    </w:p>
+    <w:p>
+      <w:pPr>
+        <w:jc w:val="both"/>
+      </w:pPr>
+    </w:p>
+    <w:p>
+      <w:pPr>
+        <w:jc w:val="center"/>
+        <w:rPr>
+          <w:noProof/>
+        </w:rPr>
+      </w:pPr>
+      <w:r>
+        <w:rPr>
+          <w:noProof/>
+        </w:rPr>
+        <w:drawing>
+          <wp:inline distT="0" distB="0" distL="0" distR="0" wp14:anchorId="0B9872AA" wp14:editId="40192260">
+            <wp:extent cx="5400000" cy="2520000"/>
+            <wp:effectExtent l="0" t="0" r="0" b="0"/>
+            <wp:docPr id="27" name="Imagem 27"/>
+            <wp:cNvGraphicFramePr>
+              <a:graphicFrameLocks xmlns:a="http://schemas.openxmlformats.org/drawingml/2006/main"/>
+            </wp:cNvGraphicFramePr>
+            <a:graphic xmlns:a="http://schemas.openxmlformats.org/drawingml/2006/main">
+              <a:graphicData uri="http://schemas.openxmlformats.org/drawingml/2006/picture">
+                <pic:pic xmlns:pic="http://schemas.openxmlformats.org/drawingml/2006/picture">
+                  <pic:nvPicPr>
+                    <pic:cNvPr id="1" name=""/>
+                    <pic:cNvPicPr preferRelativeResize="0"/>
+                  </pic:nvPicPr>
+                  <pic:blipFill>
+                    <a:blip r:embed="rId38"/>
+                    <a:stretch>
+                      <a:fillRect/>
+                    </a:stretch>
+                  </pic:blipFill>
+                  <pic:spPr>
+                    <a:xfrm>
+                      <a:off x="0" y="0"/>
+                      <a:ext cx="5400000" cy="2520000"/>
+                    </a:xfrm>
+                    <a:prstGeom prst="rect">
+                      <a:avLst/>
+                    </a:prstGeom>
+                  </pic:spPr>
+                </pic:pic>
+              </a:graphicData>
+            </a:graphic>
+          </wp:inline>
+        </w:drawing>
+      </w:r>
+    </w:p>
+    <w:p>
+      <w:pPr>
+        <w:jc w:val="center"/>
+      </w:pPr>
+      <w:r>
+        <w:t xml:space="preserve">Figura </w:t>
+      </w:r>
+      <w:r>
+        <w:t>24</w:t>
+      </w:r>
+      <w:r>
+        <w:t xml:space="preserve"> – Tela </w:t>
+      </w:r>
+      <w:r>
+        <w:t>inicial do funcionário</w:t>
+      </w:r>
+    </w:p>
+    <w:p>
+      <w:pPr>
+        <w:jc w:val="center"/>
+        <w:rPr>
+          <w:noProof/>
+        </w:rPr>
+      </w:pPr>
+    </w:p>
+    <w:p>
+      <w:pPr>
+        <w:jc w:val="center"/>
+      </w:pPr>
+      <w:r>
+        <w:rPr>
+          <w:noProof/>
+        </w:rPr>
+        <w:lastRenderedPageBreak/>
+        <w:drawing>
+          <wp:inline distT="0" distB="0" distL="0" distR="0" wp14:anchorId="5D11C0FE" wp14:editId="1DFC2518">
+            <wp:extent cx="5400000" cy="2520000"/>
+            <wp:effectExtent l="0" t="0" r="0" b="0"/>
+            <wp:docPr id="28" name="Imagem 28"/>
+            <wp:cNvGraphicFramePr>
+              <a:graphicFrameLocks xmlns:a="http://schemas.openxmlformats.org/drawingml/2006/main"/>
+            </wp:cNvGraphicFramePr>
+            <a:graphic xmlns:a="http://schemas.openxmlformats.org/drawingml/2006/main">
+              <a:graphicData uri="http://schemas.openxmlformats.org/drawingml/2006/picture">
+                <pic:pic xmlns:pic="http://schemas.openxmlformats.org/drawingml/2006/picture">
+                  <pic:nvPicPr>
+                    <pic:cNvPr id="1" name=""/>
+                    <pic:cNvPicPr preferRelativeResize="0"/>
+                  </pic:nvPicPr>
+                  <pic:blipFill>
+                    <a:blip r:embed="rId39"/>
+                    <a:stretch>
+                      <a:fillRect/>
+                    </a:stretch>
+                  </pic:blipFill>
+                  <pic:spPr>
+                    <a:xfrm>
+                      <a:off x="0" y="0"/>
+                      <a:ext cx="5400000" cy="2520000"/>
+                    </a:xfrm>
+                    <a:prstGeom prst="rect">
+                      <a:avLst/>
+                    </a:prstGeom>
+                  </pic:spPr>
+                </pic:pic>
+              </a:graphicData>
+            </a:graphic>
+          </wp:inline>
+        </w:drawing>
+      </w:r>
+    </w:p>
+    <w:p>
+      <w:pPr>
+        <w:tabs>
+          <w:tab w:val="center" w:pos="4514"/>
+          <w:tab w:val="right" w:pos="9029"/>
+        </w:tabs>
+      </w:pPr>
+      <w:r>
+        <w:tab/>
+      </w:r>
+      <w:r>
+        <w:t xml:space="preserve">Figura </w:t>
+      </w:r>
+      <w:r>
+        <w:t>25</w:t>
+      </w:r>
+      <w:r>
+        <w:t xml:space="preserve"> – Tela de </w:t>
+      </w:r>
+      <w:r>
+        <w:t>cadastro de usuário</w:t>
+      </w:r>
+      <w:r>
+        <w:tab/>
+      </w:r>
+    </w:p>
+    <w:p>
+      <w:pPr>
+        <w:jc w:val="center"/>
+      </w:pPr>
+    </w:p>
+    <w:p>
+      <w:pPr>
+        <w:jc w:val="center"/>
+      </w:pPr>
+      <w:r>
+        <w:rPr>
+          <w:noProof/>
+        </w:rPr>
+        <w:drawing>
+          <wp:inline distT="0" distB="0" distL="0" distR="0" wp14:anchorId="03C1573B" wp14:editId="4729ABD5">
+            <wp:extent cx="5400000" cy="2520000"/>
+            <wp:effectExtent l="0" t="0" r="0" b="0"/>
+            <wp:docPr id="29" name="Imagem 29"/>
+            <wp:cNvGraphicFramePr>
+              <a:graphicFrameLocks xmlns:a="http://schemas.openxmlformats.org/drawingml/2006/main"/>
+            </wp:cNvGraphicFramePr>
+            <a:graphic xmlns:a="http://schemas.openxmlformats.org/drawingml/2006/main">
+              <a:graphicData uri="http://schemas.openxmlformats.org/drawingml/2006/picture">
+                <pic:pic xmlns:pic="http://schemas.openxmlformats.org/drawingml/2006/picture">
+                  <pic:nvPicPr>
+                    <pic:cNvPr id="1" name=""/>
+                    <pic:cNvPicPr preferRelativeResize="0"/>
+                  </pic:nvPicPr>
+                  <pic:blipFill>
+                    <a:blip r:embed="rId40"/>
+                    <a:stretch>
+                      <a:fillRect/>
+                    </a:stretch>
+                  </pic:blipFill>
+                  <pic:spPr>
+                    <a:xfrm>
+                      <a:off x="0" y="0"/>
+                      <a:ext cx="5400000" cy="2520000"/>
+                    </a:xfrm>
+                    <a:prstGeom prst="rect">
+                      <a:avLst/>
+                    </a:prstGeom>
+                  </pic:spPr>
+                </pic:pic>
+              </a:graphicData>
+            </a:graphic>
+          </wp:inline>
+        </w:drawing>
+      </w:r>
+    </w:p>
+    <w:p>
+      <w:pPr>
+        <w:jc w:val="center"/>
+      </w:pPr>
+      <w:r>
+        <w:t>Figura 2</w:t>
+      </w:r>
+      <w:r>
+        <w:t>6</w:t>
+      </w:r>
+      <w:r>
+        <w:t xml:space="preserve"> – Tela de cadastro de usuário</w:t>
+      </w:r>
+    </w:p>
+    <w:p>
+      <w:pPr>
+        <w:jc w:val="center"/>
+      </w:pPr>
+    </w:p>
+    <w:p>
+      <w:pPr>
+        <w:jc w:val="center"/>
+      </w:pPr>
+      <w:r>
+        <w:rPr>
+          <w:noProof/>
+        </w:rPr>
+        <w:drawing>
+          <wp:inline distT="0" distB="0" distL="0" distR="0" wp14:anchorId="64C606F4" wp14:editId="45259AAB">
+            <wp:extent cx="5400000" cy="2520000"/>
+            <wp:effectExtent l="0" t="0" r="0" b="0"/>
+            <wp:docPr id="30" name="Imagem 30"/>
+            <wp:cNvGraphicFramePr>
+              <a:graphicFrameLocks xmlns:a="http://schemas.openxmlformats.org/drawingml/2006/main"/>
+            </wp:cNvGraphicFramePr>
+            <a:graphic xmlns:a="http://schemas.openxmlformats.org/drawingml/2006/main">
+              <a:graphicData uri="http://schemas.openxmlformats.org/drawingml/2006/picture">
+                <pic:pic xmlns:pic="http://schemas.openxmlformats.org/drawingml/2006/picture">
+                  <pic:nvPicPr>
+                    <pic:cNvPr id="1" name=""/>
+                    <pic:cNvPicPr preferRelativeResize="0"/>
+                  </pic:nvPicPr>
+                  <pic:blipFill>
+                    <a:blip r:embed="rId41"/>
+                    <a:stretch>
+                      <a:fillRect/>
+                    </a:stretch>
+                  </pic:blipFill>
+                  <pic:spPr>
+                    <a:xfrm>
+                      <a:off x="0" y="0"/>
+                      <a:ext cx="5400000" cy="2520000"/>
+                    </a:xfrm>
+                    <a:prstGeom prst="rect">
+                      <a:avLst/>
+                    </a:prstGeom>
+                  </pic:spPr>
+                </pic:pic>
+              </a:graphicData>
+            </a:graphic>
+          </wp:inline>
+        </w:drawing>
+      </w:r>
+    </w:p>
+    <w:p>
+      <w:pPr>
+        <w:jc w:val="center"/>
+      </w:pPr>
+      <w:r>
+        <w:t>Figura 2</w:t>
+      </w:r>
+      <w:r>
+        <w:t>7</w:t>
+      </w:r>
+      <w:r>
+        <w:t xml:space="preserve"> – Tela de </w:t>
+      </w:r>
+      <w:r>
+        <w:t>cadastro acadêmico</w:t>
+      </w:r>
+    </w:p>
+    <w:p>
+      <w:pPr>
+        <w:jc w:val="center"/>
+      </w:pPr>
+      <w:r>
+        <w:rPr>
+          <w:noProof/>
+        </w:rPr>
+        <w:lastRenderedPageBreak/>
+        <w:drawing>
+          <wp:inline distT="0" distB="0" distL="0" distR="0" wp14:anchorId="5A013787" wp14:editId="69BA371F">
+            <wp:extent cx="5400000" cy="2520000"/>
+            <wp:effectExtent l="0" t="0" r="0" b="0"/>
+            <wp:docPr id="31" name="Imagem 31"/>
+            <wp:cNvGraphicFramePr>
+              <a:graphicFrameLocks xmlns:a="http://schemas.openxmlformats.org/drawingml/2006/main"/>
+            </wp:cNvGraphicFramePr>
+            <a:graphic xmlns:a="http://schemas.openxmlformats.org/drawingml/2006/main">
+              <a:graphicData uri="http://schemas.openxmlformats.org/drawingml/2006/picture">
+                <pic:pic xmlns:pic="http://schemas.openxmlformats.org/drawingml/2006/picture">
+                  <pic:nvPicPr>
+                    <pic:cNvPr id="1" name=""/>
+                    <pic:cNvPicPr preferRelativeResize="0"/>
+                  </pic:nvPicPr>
+                  <pic:blipFill>
+                    <a:blip r:embed="rId42"/>
+                    <a:stretch>
+                      <a:fillRect/>
+                    </a:stretch>
+                  </pic:blipFill>
+                  <pic:spPr>
+                    <a:xfrm>
+                      <a:off x="0" y="0"/>
+                      <a:ext cx="5400000" cy="2520000"/>
+                    </a:xfrm>
+                    <a:prstGeom prst="rect">
+                      <a:avLst/>
+                    </a:prstGeom>
+                  </pic:spPr>
+                </pic:pic>
+              </a:graphicData>
+            </a:graphic>
+          </wp:inline>
+        </w:drawing>
+      </w:r>
+      <w:r>
+        <w:t xml:space="preserve">Figura </w:t>
+      </w:r>
+      <w:r>
+        <w:t>28</w:t>
+      </w:r>
+      <w:r>
+        <w:t xml:space="preserve"> – Tela d</w:t>
+      </w:r>
+      <w:r>
+        <w:t>a biblioteca virtual da escola</w:t>
+      </w:r>
+    </w:p>
+    <w:p>
+      <w:pPr>
+        <w:jc w:val="center"/>
+      </w:pPr>
+    </w:p>
+    <w:p>
+      <w:pPr>
+        <w:jc w:val="center"/>
+      </w:pPr>
+      <w:r>
+        <w:rPr>
+          <w:noProof/>
+        </w:rPr>
+        <w:drawing>
+          <wp:inline distT="0" distB="0" distL="0" distR="0" wp14:anchorId="3CBB74A9" wp14:editId="653F20B8">
+            <wp:extent cx="5400000" cy="2520000"/>
+            <wp:effectExtent l="0" t="0" r="0" b="0"/>
+            <wp:docPr id="32" name="Imagem 32"/>
+            <wp:cNvGraphicFramePr>
+              <a:graphicFrameLocks xmlns:a="http://schemas.openxmlformats.org/drawingml/2006/main"/>
+            </wp:cNvGraphicFramePr>
+            <a:graphic xmlns:a="http://schemas.openxmlformats.org/drawingml/2006/main">
+              <a:graphicData uri="http://schemas.openxmlformats.org/drawingml/2006/picture">
+                <pic:pic xmlns:pic="http://schemas.openxmlformats.org/drawingml/2006/picture">
+                  <pic:nvPicPr>
+                    <pic:cNvPr id="1" name=""/>
+                    <pic:cNvPicPr preferRelativeResize="0"/>
+                  </pic:nvPicPr>
+                  <pic:blipFill>
+                    <a:blip r:embed="rId43"/>
+                    <a:stretch>
+                      <a:fillRect/>
+                    </a:stretch>
+                  </pic:blipFill>
+                  <pic:spPr>
+                    <a:xfrm>
+                      <a:off x="0" y="0"/>
+                      <a:ext cx="5400000" cy="2520000"/>
+                    </a:xfrm>
+                    <a:prstGeom prst="rect">
+                      <a:avLst/>
+                    </a:prstGeom>
+                  </pic:spPr>
+                </pic:pic>
+              </a:graphicData>
+            </a:graphic>
+          </wp:inline>
+        </w:drawing>
+      </w:r>
+    </w:p>
+    <w:p>
+      <w:pPr>
+        <w:jc w:val="center"/>
+      </w:pPr>
+      <w:r>
+        <w:t>Figura 2</w:t>
+      </w:r>
+      <w:r>
+        <w:t>9</w:t>
+      </w:r>
+      <w:r>
+        <w:t xml:space="preserve"> – Tela da biblioteca virtual da escola</w:t>
+      </w:r>
+    </w:p>
+    <w:p>
+      <w:pPr>
+        <w:jc w:val="center"/>
+      </w:pPr>
+    </w:p>
+    <w:p>
+      <w:pPr>
         <w:jc w:val="both"/>
       </w:pPr>
     </w:p>
@@ -15792,8 +16538,8 @@
           <w:szCs w:val="26"/>
         </w:rPr>
       </w:pPr>
-      <w:bookmarkStart w:id="14" w:name="_4b3d1l3sk5wt" w:colFirst="0" w:colLast="0"/>
-      <w:bookmarkEnd w:id="14"/>
+      <w:bookmarkStart w:id="15" w:name="_4b3d1l3sk5wt" w:colFirst="0" w:colLast="0"/>
+      <w:bookmarkEnd w:id="15"/>
       <w:r>
         <w:rPr>
           <w:b/>
@@ -15813,8 +16559,8 @@
           <w:rFonts w:eastAsia="Times New Roman"/>
         </w:rPr>
       </w:pPr>
-      <w:bookmarkStart w:id="15" w:name="_a175ndyph61" w:colFirst="0" w:colLast="0"/>
-      <w:bookmarkEnd w:id="15"/>
+      <w:bookmarkStart w:id="16" w:name="_a175ndyph61" w:colFirst="0" w:colLast="0"/>
+      <w:bookmarkEnd w:id="16"/>
       <w:r>
         <w:rPr>
           <w:rFonts w:eastAsia="Times New Roman"/>
@@ -16010,6 +16756,56 @@
     </w:sectPr>
   </w:body>
 </w:document>
+</file>
+
+<file path=word/endnotes.xml><?xml version="1.0" encoding="utf-8"?>
+<w:endnotes xmlns:wpc="http://schemas.microsoft.com/office/word/2010/wordprocessingCanvas" xmlns:cx="http://schemas.microsoft.com/office/drawing/2014/chartex" xmlns:cx1="http://schemas.microsoft.com/office/drawing/2015/9/8/chartex" xmlns:cx2="http://schemas.microsoft.com/office/drawing/2015/10/21/chartex" xmlns:cx3="http://schemas.microsoft.com/office/drawing/2016/5/9/chartex" xmlns:cx4="http://schemas.microsoft.com/office/drawing/2016/5/10/chartex" xmlns:cx5="http://schemas.microsoft.com/office/drawing/2016/5/11/chartex" xmlns:cx6="http://schemas.microsoft.com/office/drawing/2016/5/12/chartex" xmlns:cx7="http://schemas.microsoft.com/office/drawing/2016/5/13/chartex" xmlns:cx8="http://schemas.microsoft.com/office/drawing/2016/5/14/chartex" xmlns:mc="http://schemas.openxmlformats.org/markup-compatibility/2006" xmlns:aink="http://schemas.microsoft.com/office/drawing/2016/ink" xmlns:am3d="http://schemas.microsoft.com/office/drawing/2017/model3d" xmlns:o="urn:schemas-microsoft-com:office:office" xmlns:r="http://schemas.openxmlformats.org/officeDocument/2006/relationships" xmlns:m="http://schemas.openxmlformats.org/officeDocument/2006/math" xmlns:v="urn:schemas-microsoft-com:vml" xmlns:wp14="http://schemas.microsoft.com/office/word/2010/wordprocessingDrawing" xmlns:wp="http://schemas.openxmlformats.org/drawingml/2006/wordprocessingDrawing" xmlns:w10="urn:schemas-microsoft-com:office:word" xmlns:w="http://schemas.openxmlformats.org/wordprocessingml/2006/main" xmlns:w14="http://schemas.microsoft.com/office/word/2010/wordml" xmlns:w15="http://schemas.microsoft.com/office/word/2012/wordml" xmlns:w16cex="http://schemas.microsoft.com/office/word/2018/wordml/cex" xmlns:w16cid="http://schemas.microsoft.com/office/word/2016/wordml/cid" xmlns:w16="http://schemas.microsoft.com/office/word/2018/wordml" xmlns:w16sdtdh="http://schemas.microsoft.com/office/word/2020/wordml/sdtdatahash" xmlns:w16se="http://schemas.microsoft.com/office/word/2015/wordml/symex" xmlns:wpg="http://schemas.microsoft.com/office/word/2010/wordprocessingGroup" xmlns:wpi="http://schemas.microsoft.com/office/word/2010/wordprocessingInk" xmlns:wne="http://schemas.microsoft.com/office/word/2006/wordml" xmlns:wps="http://schemas.microsoft.com/office/word/2010/wordprocessingShape" mc:Ignorable="w14 w15 w16se w16cid w16 w16cex w16sdtdh wp14">
+  <w:endnote w:type="separator" w:id="-1">
+    <w:p>
+      <w:pPr>
+        <w:spacing w:line="240" w:lineRule="auto"/>
+      </w:pPr>
+      <w:r>
+        <w:separator/>
+      </w:r>
+    </w:p>
+  </w:endnote>
+  <w:endnote w:type="continuationSeparator" w:id="0">
+    <w:p>
+      <w:pPr>
+        <w:spacing w:line="240" w:lineRule="auto"/>
+      </w:pPr>
+      <w:r>
+        <w:continuationSeparator/>
+      </w:r>
+    </w:p>
+  </w:endnote>
+</w:endnotes>
+</file>
+
+<file path=word/footnotes.xml><?xml version="1.0" encoding="utf-8"?>
+<w:footnotes xmlns:wpc="http://schemas.microsoft.com/office/word/2010/wordprocessingCanvas" xmlns:cx="http://schemas.microsoft.com/office/drawing/2014/chartex" xmlns:cx1="http://schemas.microsoft.com/office/drawing/2015/9/8/chartex" xmlns:cx2="http://schemas.microsoft.com/office/drawing/2015/10/21/chartex" xmlns:cx3="http://schemas.microsoft.com/office/drawing/2016/5/9/chartex" xmlns:cx4="http://schemas.microsoft.com/office/drawing/2016/5/10/chartex" xmlns:cx5="http://schemas.microsoft.com/office/drawing/2016/5/11/chartex" xmlns:cx6="http://schemas.microsoft.com/office/drawing/2016/5/12/chartex" xmlns:cx7="http://schemas.microsoft.com/office/drawing/2016/5/13/chartex" xmlns:cx8="http://schemas.microsoft.com/office/drawing/2016/5/14/chartex" xmlns:mc="http://schemas.openxmlformats.org/markup-compatibility/2006" xmlns:aink="http://schemas.microsoft.com/office/drawing/2016/ink" xmlns:am3d="http://schemas.microsoft.com/office/drawing/2017/model3d" xmlns:o="urn:schemas-microsoft-com:office:office" xmlns:r="http://schemas.openxmlformats.org/officeDocument/2006/relationships" xmlns:m="http://schemas.openxmlformats.org/officeDocument/2006/math" xmlns:v="urn:schemas-microsoft-com:vml" xmlns:wp14="http://schemas.microsoft.com/office/word/2010/wordprocessingDrawing" xmlns:wp="http://schemas.openxmlformats.org/drawingml/2006/wordprocessingDrawing" xmlns:w10="urn:schemas-microsoft-com:office:word" xmlns:w="http://schemas.openxmlformats.org/wordprocessingml/2006/main" xmlns:w14="http://schemas.microsoft.com/office/word/2010/wordml" xmlns:w15="http://schemas.microsoft.com/office/word/2012/wordml" xmlns:w16cex="http://schemas.microsoft.com/office/word/2018/wordml/cex" xmlns:w16cid="http://schemas.microsoft.com/office/word/2016/wordml/cid" xmlns:w16="http://schemas.microsoft.com/office/word/2018/wordml" xmlns:w16sdtdh="http://schemas.microsoft.com/office/word/2020/wordml/sdtdatahash" xmlns:w16se="http://schemas.microsoft.com/office/word/2015/wordml/symex" xmlns:wpg="http://schemas.microsoft.com/office/word/2010/wordprocessingGroup" xmlns:wpi="http://schemas.microsoft.com/office/word/2010/wordprocessingInk" xmlns:wne="http://schemas.microsoft.com/office/word/2006/wordml" xmlns:wps="http://schemas.microsoft.com/office/word/2010/wordprocessingShape" mc:Ignorable="w14 w15 w16se w16cid w16 w16cex w16sdtdh wp14">
+  <w:footnote w:type="separator" w:id="-1">
+    <w:p>
+      <w:pPr>
+        <w:spacing w:line="240" w:lineRule="auto"/>
+      </w:pPr>
+      <w:r>
+        <w:separator/>
+      </w:r>
+    </w:p>
+  </w:footnote>
+  <w:footnote w:type="continuationSeparator" w:id="0">
+    <w:p>
+      <w:pPr>
+        <w:spacing w:line="240" w:lineRule="auto"/>
+      </w:pPr>
+      <w:r>
+        <w:continuationSeparator/>
+      </w:r>
+    </w:p>
+  </w:footnote>
+</w:footnotes>
 </file>
 
 <file path=word/numbering.xml><?xml version="1.0" encoding="utf-8"?>
@@ -23188,6 +23984,50 @@
       <w:bCs/>
     </w:rPr>
   </w:style>
+  <w:style w:type="paragraph" w:styleId="Cabealho">
+    <w:name w:val="header"/>
+    <w:basedOn w:val="Normal"/>
+    <w:link w:val="CabealhoChar"/>
+    <w:uiPriority w:val="99"/>
+    <w:unhideWhenUsed/>
+    <w:rsid w:val="00D9678F"/>
+    <w:pPr>
+      <w:tabs>
+        <w:tab w:val="center" w:pos="4252"/>
+        <w:tab w:val="right" w:pos="8504"/>
+      </w:tabs>
+      <w:spacing w:line="240" w:lineRule="auto"/>
+    </w:pPr>
+  </w:style>
+  <w:style w:type="character" w:customStyle="1" w:styleId="CabealhoChar">
+    <w:name w:val="Cabeçalho Char"/>
+    <w:basedOn w:val="Fontepargpadro"/>
+    <w:link w:val="Cabealho"/>
+    <w:uiPriority w:val="99"/>
+    <w:rsid w:val="00D9678F"/>
+  </w:style>
+  <w:style w:type="paragraph" w:styleId="Rodap">
+    <w:name w:val="footer"/>
+    <w:basedOn w:val="Normal"/>
+    <w:link w:val="RodapChar"/>
+    <w:uiPriority w:val="99"/>
+    <w:unhideWhenUsed/>
+    <w:rsid w:val="00D9678F"/>
+    <w:pPr>
+      <w:tabs>
+        <w:tab w:val="center" w:pos="4252"/>
+        <w:tab w:val="right" w:pos="8504"/>
+      </w:tabs>
+      <w:spacing w:line="240" w:lineRule="auto"/>
+    </w:pPr>
+  </w:style>
+  <w:style w:type="character" w:customStyle="1" w:styleId="RodapChar">
+    <w:name w:val="Rodapé Char"/>
+    <w:basedOn w:val="Fontepargpadro"/>
+    <w:link w:val="Rodap"/>
+    <w:uiPriority w:val="99"/>
+    <w:rsid w:val="00D9678F"/>
+  </w:style>
 </w:styles>
 </file>
 
@@ -23512,15 +24352,6 @@
 </file>
 
 <file path=customXml/item1.xml><?xml version="1.0" encoding="utf-8"?>
-<?mso-contentType ?>
-<FormTemplates xmlns="http://schemas.microsoft.com/sharepoint/v3/contenttype/forms">
-  <Display>DocumentLibraryForm</Display>
-  <Edit>DocumentLibraryForm</Edit>
-  <New>DocumentLibraryForm</New>
-</FormTemplates>
-</file>
-
-<file path=customXml/item2.xml><?xml version="1.0" encoding="utf-8"?>
 <p:properties xmlns:p="http://schemas.microsoft.com/office/2006/metadata/properties" xmlns:xsi="http://www.w3.org/2001/XMLSchema-instance" xmlns:pc="http://schemas.microsoft.com/office/infopath/2007/PartnerControls">
   <documentManagement>
     <lcf76f155ced4ddcb4097134ff3c332f xmlns="5ef1b77c-38b8-414a-8721-d26a6c8834e3">
@@ -23528,6 +24359,15 @@
     </lcf76f155ced4ddcb4097134ff3c332f>
   </documentManagement>
 </p:properties>
+</file>
+
+<file path=customXml/item2.xml><?xml version="1.0" encoding="utf-8"?>
+<?mso-contentType ?>
+<FormTemplates xmlns="http://schemas.microsoft.com/sharepoint/v3/contenttype/forms">
+  <Display>DocumentLibraryForm</Display>
+  <Edit>DocumentLibraryForm</Edit>
+  <New>DocumentLibraryForm</New>
+</FormTemplates>
 </file>
 
 <file path=customXml/item3.xml><?xml version="1.0" encoding="utf-8"?>
@@ -23703,19 +24543,19 @@
 </file>
 
 <file path=customXml/itemProps1.xml><?xml version="1.0" encoding="utf-8"?>
-<ds:datastoreItem xmlns:ds="http://schemas.openxmlformats.org/officeDocument/2006/customXml" ds:itemID="{F0216F97-3B5D-45F7-94AC-3959B35F731A}">
+<ds:datastoreItem xmlns:ds="http://schemas.openxmlformats.org/officeDocument/2006/customXml" ds:itemID="{F4FF9EA9-49AD-4E6F-BF55-5E4E734B6122}">
   <ds:schemaRefs>
-    <ds:schemaRef ds:uri="http://schemas.microsoft.com/sharepoint/v3/contenttype/forms"/>
+    <ds:schemaRef ds:uri="http://schemas.microsoft.com/office/2006/metadata/properties"/>
+    <ds:schemaRef ds:uri="http://schemas.microsoft.com/office/infopath/2007/PartnerControls"/>
+    <ds:schemaRef ds:uri="5ef1b77c-38b8-414a-8721-d26a6c8834e3"/>
   </ds:schemaRefs>
 </ds:datastoreItem>
 </file>
 
 <file path=customXml/itemProps2.xml><?xml version="1.0" encoding="utf-8"?>
-<ds:datastoreItem xmlns:ds="http://schemas.openxmlformats.org/officeDocument/2006/customXml" ds:itemID="{F4FF9EA9-49AD-4E6F-BF55-5E4E734B6122}">
+<ds:datastoreItem xmlns:ds="http://schemas.openxmlformats.org/officeDocument/2006/customXml" ds:itemID="{F0216F97-3B5D-45F7-94AC-3959B35F731A}">
   <ds:schemaRefs>
-    <ds:schemaRef ds:uri="http://schemas.microsoft.com/office/2006/metadata/properties"/>
-    <ds:schemaRef ds:uri="http://schemas.microsoft.com/office/infopath/2007/PartnerControls"/>
-    <ds:schemaRef ds:uri="5ef1b77c-38b8-414a-8721-d26a6c8834e3"/>
+    <ds:schemaRef ds:uri="http://schemas.microsoft.com/sharepoint/v3/contenttype/forms"/>
   </ds:schemaRefs>
 </ds:datastoreItem>
 </file>

</xml_diff>